<commit_message>
added different pipeline with blueprint aproach
</commit_message>
<xml_diff>
--- a/reference_files/reference.docx
+++ b/reference_files/reference.docx
@@ -865,7 +865,7 @@
     <w:link w:val="Heading1Char"/>
     <w:uiPriority w:val="9"/>
     <w:qFormat/>
-    <w:rsid w:val="00C32860"/>
+    <w:rsid w:val="00874460"/>
     <w:pPr>
       <w:keepNext/>
       <w:keepLines/>
@@ -877,7 +877,7 @@
       <w:rFonts w:eastAsiaTheme="majorEastAsia" w:cstheme="majorBidi"/>
       <w:b/>
       <w:bCs/>
-      <w:color w:val="000000" w:themeColor="text1"/>
+      <w:color w:val="365F91" w:themeColor="accent1" w:themeShade="BF"/>
       <w:sz w:val="52"/>
       <w:szCs w:val="28"/>
     </w:rPr>
@@ -890,7 +890,7 @@
     <w:uiPriority w:val="9"/>
     <w:unhideWhenUsed/>
     <w:qFormat/>
-    <w:rsid w:val="00C32860"/>
+    <w:rsid w:val="00874460"/>
     <w:pPr>
       <w:keepNext/>
       <w:keepLines/>
@@ -902,7 +902,7 @@
       <w:rFonts w:eastAsiaTheme="majorEastAsia" w:cstheme="majorBidi"/>
       <w:b/>
       <w:bCs/>
-      <w:color w:val="000000" w:themeColor="text1"/>
+      <w:color w:val="365F91" w:themeColor="accent1" w:themeShade="BF"/>
       <w:sz w:val="36"/>
       <w:szCs w:val="26"/>
     </w:rPr>
@@ -915,7 +915,7 @@
     <w:uiPriority w:val="9"/>
     <w:unhideWhenUsed/>
     <w:qFormat/>
-    <w:rsid w:val="00C32860"/>
+    <w:rsid w:val="00874460"/>
     <w:pPr>
       <w:keepNext/>
       <w:keepLines/>
@@ -927,7 +927,7 @@
       <w:rFonts w:eastAsiaTheme="majorEastAsia" w:cstheme="majorBidi"/>
       <w:b/>
       <w:bCs/>
-      <w:color w:val="000000" w:themeColor="text1"/>
+      <w:color w:val="365F91" w:themeColor="accent1" w:themeShade="BF"/>
     </w:rPr>
   </w:style>
   <w:style w:type="paragraph" w:styleId="Heading4">
@@ -939,7 +939,7 @@
     <w:semiHidden/>
     <w:unhideWhenUsed/>
     <w:qFormat/>
-    <w:rsid w:val="00FC693F"/>
+    <w:rsid w:val="00874460"/>
     <w:pPr>
       <w:keepNext/>
       <w:keepLines/>
@@ -952,7 +952,7 @@
       <w:bCs/>
       <w:i/>
       <w:iCs/>
-      <w:color w:val="4F81BD" w:themeColor="accent1"/>
+      <w:color w:val="365F91" w:themeColor="accent1" w:themeShade="BF"/>
     </w:rPr>
   </w:style>
   <w:style w:type="paragraph" w:styleId="Heading5">
@@ -1153,12 +1153,12 @@
     <w:basedOn w:val="DefaultParagraphFont"/>
     <w:link w:val="Heading1"/>
     <w:uiPriority w:val="9"/>
-    <w:rsid w:val="00C32860"/>
+    <w:rsid w:val="00874460"/>
     <w:rPr>
       <w:rFonts w:ascii="Times New Roman" w:eastAsiaTheme="majorEastAsia" w:hAnsi="Times New Roman" w:cstheme="majorBidi"/>
       <w:b/>
       <w:bCs/>
-      <w:color w:val="000000" w:themeColor="text1"/>
+      <w:color w:val="365F91" w:themeColor="accent1" w:themeShade="BF"/>
       <w:sz w:val="52"/>
       <w:szCs w:val="28"/>
     </w:rPr>
@@ -1168,12 +1168,12 @@
     <w:basedOn w:val="DefaultParagraphFont"/>
     <w:link w:val="Heading2"/>
     <w:uiPriority w:val="9"/>
-    <w:rsid w:val="00C32860"/>
+    <w:rsid w:val="00874460"/>
     <w:rPr>
       <w:rFonts w:ascii="Times New Roman" w:eastAsiaTheme="majorEastAsia" w:hAnsi="Times New Roman" w:cstheme="majorBidi"/>
       <w:b/>
       <w:bCs/>
-      <w:color w:val="000000" w:themeColor="text1"/>
+      <w:color w:val="365F91" w:themeColor="accent1" w:themeShade="BF"/>
       <w:sz w:val="36"/>
       <w:szCs w:val="26"/>
     </w:rPr>
@@ -1183,12 +1183,12 @@
     <w:basedOn w:val="DefaultParagraphFont"/>
     <w:link w:val="Heading3"/>
     <w:uiPriority w:val="9"/>
-    <w:rsid w:val="00C32860"/>
+    <w:rsid w:val="00874460"/>
     <w:rPr>
       <w:rFonts w:ascii="Times New Roman" w:eastAsiaTheme="majorEastAsia" w:hAnsi="Times New Roman" w:cstheme="majorBidi"/>
       <w:b/>
       <w:bCs/>
-      <w:color w:val="000000" w:themeColor="text1"/>
+      <w:color w:val="365F91" w:themeColor="accent1" w:themeShade="BF"/>
       <w:sz w:val="24"/>
     </w:rPr>
   </w:style>
@@ -1556,14 +1556,15 @@
     <w:link w:val="Heading4"/>
     <w:uiPriority w:val="9"/>
     <w:semiHidden/>
-    <w:rsid w:val="00FC693F"/>
+    <w:rsid w:val="00874460"/>
     <w:rPr>
       <w:rFonts w:asciiTheme="majorHAnsi" w:eastAsiaTheme="majorEastAsia" w:hAnsiTheme="majorHAnsi" w:cstheme="majorBidi"/>
       <w:b/>
       <w:bCs/>
       <w:i/>
       <w:iCs/>
-      <w:color w:val="4F81BD" w:themeColor="accent1"/>
+      <w:color w:val="365F91" w:themeColor="accent1" w:themeShade="BF"/>
+      <w:sz w:val="24"/>
     </w:rPr>
   </w:style>
   <w:style w:type="character" w:customStyle="1" w:styleId="Heading5Char">

</xml_diff>